<commit_message>
fix(detection): expand phone pattern and align synthetic SSN generator to pass independent verification (INT-010)
</commit_message>
<xml_diff>
--- a/demo_samples/fixtures/06_multi_category.docx
+++ b/demo_samples/fixtures/06_multi_category.docx
@@ -17,7 +17,7 @@
     </w:p>
     <w:p>
       <w:r>
-        <w:t>Auditor: CAD-EMP-65392 | Contact: jordan.fictional703@testcorp.internal</w:t>
+        <w:t>Auditor: CAD-EMP-30379 | Contact: alex.testperson814@cadence-demo.test</w:t>
       </w:r>
     </w:p>
     <w:tbl>
@@ -89,7 +89,7 @@
           </w:tcPr>
           <w:p>
             <w:r>
-              <w:t>(555) 0100-3615</w:t>
+              <w:t>(555) 0143-5552</w:t>
             </w:r>
           </w:p>
         </w:tc>

</xml_diff>